<commit_message>
caaf opening-brief, petition-supplement: shared cross-engine layout model (lib/*/xengine*), docx breaks every line and page as typst; params.cross_engine: gate
typst: Times New Roman 14 pt in 25.9 pt body (the former 0.94 em leading) and 14.4 pt single line boxes, footnotes at
the single pitch (they were laid out at 21.4 pt), listing-row index and authorities, cover, signature and
certificate lines as blocks with explicit spaces. docx: armfor.lua on docx.xengine, index and authorities page
numbers from the multi-pass engine, footer at the typst distance, word counts as typst (1,833 and 1,303), word
joiner in ')(' tokens, leader lead-in as four-per-em spaces (xe.LEAD's no-break spaces wrap 4.6 pt early in
LibreOffice); reference.docx from make-reference.sh (lib/docx/xengine-reference.sh; it was EB Garamond,
DEF-FONT-002), render.sh and build-reference.sh retired. XENG-001..003 PASS (303/303, 227/227 lines); check.sh
typst 8/0, docx 12/0 (fb-595.54.7)
</commit_message>
<xml_diff>
--- a/courts/military/court-of-appeals-for-the-armed-forces/opening-brief/docx/reference.docx
+++ b/courts/military/court-of-appeals-for-the-armed-forces/opening-brief/docx/reference.docx
@@ -314,10 +314,9 @@
       </w:r>
     </w:p>
     <w:sectPr>
-      <w:footerReference w:type="default" r:id="rId100"/>
+      <w:footerReference w:type="default" r:id="rIdFooter1"/>
       <w:pgSz w:w="12240" w:h="15840"/>
-      <w:pgMar w:top="1440" w:right="1440" w:bottom="1440" w:left="1440" w:header="720" w:footer="720" w:gutter="0"/>
-      <w:pgNumType w:fmt="decimal" w:start="1"/>
+      <w:pgMar w:top="1440" w:right="1440" w:bottom="1440" w:left="1440" w:header="720" w:footer="718" w:gutter="0"/>
     </w:sectPr>
   </w:body>
 </w:document>
@@ -331,10 +330,7 @@
 <w:ftr xmlns:w="http://schemas.openxmlformats.org/wordprocessingml/2006/main" xmlns:r="http://schemas.openxmlformats.org/officeDocument/2006/relationships">
   <w:p>
     <w:pPr>
-      <w:pStyle w:val="Footer"/>
       <w:jc w:val="center"/>
-      <w:spacing w:before="0" w:after="0" w:line="240" w:lineRule="auto"/>
-      <w:ind w:firstLine="0"/>
     </w:pPr>
     <w:r>
       <w:fldChar w:fldCharType="begin"/>
@@ -514,59 +510,46 @@
   <w:docDefaults>
     <w:rPrDefault>
       <w:rPr>
-        <w:rFonts w:ascii="EB Garamond" w:hAnsi="EB Garamond" w:eastAsia="EB Garamond" w:cs="EB Garamond"/>
+        <w:rFonts w:ascii="Times New Roman" w:hAnsi="Times New Roman" w:eastAsia="Times New Roman" w:cs="Times New Roman"/>
         <w:sz w:val="28"/>
         <w:szCs w:val="28"/>
-        <w:lang w:val="en-US" w:eastAsia="en-US" w:bidi="ar-SA"/>
+        <w:lang w:val="en-US" w:eastAsia="zh-CN" w:bidi="ar-SA"/>
       </w:rPr>
     </w:rPrDefault>
     <w:pPrDefault>
       <w:pPr>
-        <w:spacing w:after="0" w:line="240" w:lineRule="auto"/>
+        <w:widowControl/>
+        <w:spacing w:after="0"/>
       </w:pPr>
     </w:pPrDefault>
   </w:docDefaults>
   <w:latentStyles w:defLockedState="0" w:defUIPriority="0" w:defSemiHidden="0" w:defUnhideWhenUsed="0" w:defQFormat="0" w:count="276"/>
-  <w:style w:type="paragraph" w:styleId="Normal">
+  <w:style w:type="paragraph" w:default="1" w:styleId="Normal">
     <w:name w:val="Normal"/>
     <w:qFormat/>
-    <w:pPr>
-      <w:spacing w:before="0" w:after="0" w:line="240" w:lineRule="auto"/>
-      <w:jc w:val="left"/>
-    </w:pPr>
-    <w:rPr>
-      <w:rFonts w:ascii="EB Garamond" w:hAnsi="EB Garamond" w:eastAsia="EB Garamond" w:cs="EB Garamond"/>
-      <w:color w:val="000000"/>
-      <w:sz w:val="28"/>
-      <w:szCs w:val="28"/>
-    </w:rPr>
   </w:style>
   <w:style w:type="paragraph" w:styleId="BodyText">
     <w:name w:val="Body Text"/>
     <w:basedOn w:val="Normal"/>
-    <w:qFormat/>
-    <w:pPr>
-      <w:spacing w:before="0" w:after="0" w:line="628" w:lineRule="exact"/>
-      <w:ind w:left="0" w:firstLine="720"/>
-    </w:pPr>
-  </w:style>
-  <w:style w:type="paragraph" w:styleId="FirstParagraph">
+    <w:link w:val="BodyTextChar"/>
+    <w:qFormat/>
+    <w:pPr>
+      <w:spacing w:before="0" w:after="0" w:line="518" w:lineRule="exact"/>
+      <w:ind w:firstLine="720"/>
+    </w:pPr>
+  </w:style>
+  <w:style w:type="paragraph" w:customStyle="1" w:styleId="FirstParagraph">
     <w:name w:val="First Paragraph"/>
     <w:basedOn w:val="BodyText"/>
     <w:next w:val="BodyText"/>
     <w:qFormat/>
-    <w:pPr>
-      <w:spacing w:before="0" w:after="0" w:line="628" w:lineRule="exact"/>
-      <w:ind w:left="0" w:firstLine="720"/>
-    </w:pPr>
-  </w:style>
-  <w:style w:type="paragraph" w:styleId="Compact">
+  </w:style>
+  <w:style w:type="paragraph" w:customStyle="1" w:styleId="Compact">
     <w:name w:val="Compact"/>
     <w:basedOn w:val="BodyText"/>
     <w:qFormat/>
     <w:pPr>
-      <w:spacing w:before="0" w:after="0" w:line="628" w:lineRule="exact"/>
-      <w:ind w:left="0" w:firstLine="720"/>
+      <w:spacing w:before="36" w:after="36"/>
     </w:pPr>
   </w:style>
   <w:style w:type="paragraph" w:styleId="Title">
@@ -706,18 +689,26 @@
     <w:name w:val="heading 1"/>
     <w:basedOn w:val="Normal"/>
     <w:next w:val="BodyText"/>
-    <w:uiPriority w:val="9"/>
-    <w:qFormat/>
+    <w:link w:val="Heading1Char"/>
+    <w:uiPriority w:val="9"/>
+    <w:qFormat/>
+    <w:rsid w:val="00A10FD9"/>
     <w:pPr>
       <w:keepNext/>
       <w:keepLines/>
-      <w:spacing w:before="420" w:after="308" w:line="240" w:lineRule="auto"/>
+      <w:spacing w:before="240" w:after="120" w:line="288" w:lineRule="exact"/>
+      <w:ind w:firstLine="0"/>
       <w:jc w:val="center"/>
       <w:outlineLvl w:val="0"/>
     </w:pPr>
     <w:rPr>
+      <w:rFonts w:ascii="Times New Roman" w:hAnsi="Times New Roman" w:eastAsia="Times New Roman" w:cs="Times New Roman"/>
       <w:b/>
       <w:bCs/>
+      <w:caps/>
+      <w:color w:val="000000"/>
+      <w:sz w:val="28"/>
+      <w:szCs w:val="28"/>
     </w:rPr>
   </w:style>
   <w:style w:type="paragraph" w:styleId="Heading2">
@@ -733,9 +724,207 @@
     <w:pPr>
       <w:keepNext/>
       <w:keepLines/>
-      <w:spacing w:before="160" w:after="80"/>
+      <w:spacing w:before="240" w:after="120" w:line="288" w:lineRule="exact"/>
+      <w:ind w:firstLine="0"/>
       <w:outlineLvl w:val="1"/>
     </w:pPr>
+    <w:rPr>
+      <w:rFonts w:ascii="Times New Roman" w:hAnsi="Times New Roman" w:eastAsia="Times New Roman" w:cs="Times New Roman"/>
+      <w:b/>
+      <w:bCs/>
+      <w:color w:val="000000"/>
+      <w:sz w:val="28"/>
+      <w:szCs w:val="28"/>
+    </w:rPr>
+  </w:style>
+  <w:style w:type="paragraph" w:styleId="Heading3">
+    <w:name w:val="heading 3"/>
+    <w:basedOn w:val="Normal"/>
+    <w:next w:val="BodyText"/>
+    <w:link w:val="Heading3Char"/>
+    <w:uiPriority w:val="9"/>
+    <w:semiHidden/>
+    <w:unhideWhenUsed/>
+    <w:qFormat/>
+    <w:rsid w:val="00A10FD9"/>
+    <w:pPr>
+      <w:keepNext/>
+      <w:keepLines/>
+      <w:spacing w:before="240" w:after="120" w:line="288" w:lineRule="exact"/>
+      <w:ind w:firstLine="0"/>
+      <w:outlineLvl w:val="2"/>
+    </w:pPr>
+    <w:rPr>
+      <w:rFonts w:ascii="Times New Roman" w:hAnsi="Times New Roman" w:eastAsia="Times New Roman" w:cs="Times New Roman"/>
+      <w:b/>
+      <w:bCs/>
+      <w:color w:val="000000"/>
+      <w:sz w:val="28"/>
+      <w:szCs w:val="28"/>
+    </w:rPr>
+  </w:style>
+  <w:style w:type="paragraph" w:styleId="Heading4">
+    <w:name w:val="heading 4"/>
+    <w:basedOn w:val="Normal"/>
+    <w:next w:val="BodyText"/>
+    <w:link w:val="Heading4Char"/>
+    <w:uiPriority w:val="9"/>
+    <w:semiHidden/>
+    <w:unhideWhenUsed/>
+    <w:qFormat/>
+    <w:rsid w:val="00A10FD9"/>
+    <w:pPr>
+      <w:keepNext/>
+      <w:keepLines/>
+      <w:spacing w:before="240" w:after="120" w:line="288" w:lineRule="exact"/>
+      <w:ind w:firstLine="0"/>
+      <w:outlineLvl w:val="3"/>
+    </w:pPr>
+    <w:rPr>
+      <w:rFonts w:ascii="Times New Roman" w:hAnsi="Times New Roman" w:eastAsia="Times New Roman" w:cs="Times New Roman"/>
+      <w:b/>
+      <w:bCs/>
+      <w:i/>
+      <w:color w:val="000000"/>
+      <w:sz w:val="28"/>
+      <w:szCs w:val="28"/>
+    </w:rPr>
+  </w:style>
+  <w:style w:type="paragraph" w:styleId="Heading5">
+    <w:name w:val="heading 5"/>
+    <w:basedOn w:val="Normal"/>
+    <w:next w:val="BodyText"/>
+    <w:link w:val="Heading5Char"/>
+    <w:uiPriority w:val="9"/>
+    <w:semiHidden/>
+    <w:unhideWhenUsed/>
+    <w:qFormat/>
+    <w:rsid w:val="00A10FD9"/>
+    <w:pPr>
+      <w:keepNext/>
+      <w:keepLines/>
+      <w:spacing w:before="240" w:after="120" w:line="288" w:lineRule="exact"/>
+      <w:ind w:firstLine="0"/>
+      <w:outlineLvl w:val="4"/>
+    </w:pPr>
+    <w:rPr>
+      <w:rFonts w:ascii="Times New Roman" w:hAnsi="Times New Roman" w:eastAsia="Times New Roman" w:cs="Times New Roman"/>
+      <w:b/>
+      <w:bCs/>
+      <w:i/>
+      <w:color w:val="000000"/>
+      <w:sz w:val="28"/>
+      <w:szCs w:val="28"/>
+    </w:rPr>
+  </w:style>
+  <w:style w:type="paragraph" w:styleId="Heading6">
+    <w:name w:val="heading 6"/>
+    <w:basedOn w:val="Normal"/>
+    <w:next w:val="BodyText"/>
+    <w:link w:val="Heading6Char"/>
+    <w:uiPriority w:val="9"/>
+    <w:semiHidden/>
+    <w:unhideWhenUsed/>
+    <w:qFormat/>
+    <w:rsid w:val="00A10FD9"/>
+    <w:pPr>
+      <w:keepNext/>
+      <w:keepLines/>
+      <w:spacing w:before="40" w:after="0"/>
+      <w:outlineLvl w:val="5"/>
+    </w:pPr>
+    <w:rPr>
+      <w:rFonts w:eastAsiaTheme="majorEastAsia" w:cstheme="majorBidi"/>
+      <w:i/>
+      <w:iCs/>
+      <w:color w:val="595959" w:themeColor="text1" w:themeTint="A6"/>
+    </w:rPr>
+  </w:style>
+  <w:style w:type="paragraph" w:styleId="Heading7">
+    <w:name w:val="heading 7"/>
+    <w:basedOn w:val="Normal"/>
+    <w:next w:val="BodyText"/>
+    <w:link w:val="Heading7Char"/>
+    <w:uiPriority w:val="9"/>
+    <w:semiHidden/>
+    <w:unhideWhenUsed/>
+    <w:qFormat/>
+    <w:rsid w:val="00A10FD9"/>
+    <w:pPr>
+      <w:keepNext/>
+      <w:keepLines/>
+      <w:spacing w:before="40" w:after="0"/>
+      <w:outlineLvl w:val="6"/>
+    </w:pPr>
+    <w:rPr>
+      <w:rFonts w:eastAsiaTheme="majorEastAsia" w:cstheme="majorBidi"/>
+      <w:color w:val="595959" w:themeColor="text1" w:themeTint="A6"/>
+    </w:rPr>
+  </w:style>
+  <w:style w:type="paragraph" w:styleId="Heading8">
+    <w:name w:val="heading 8"/>
+    <w:basedOn w:val="Normal"/>
+    <w:next w:val="BodyText"/>
+    <w:link w:val="Heading8Char"/>
+    <w:uiPriority w:val="9"/>
+    <w:semiHidden/>
+    <w:unhideWhenUsed/>
+    <w:qFormat/>
+    <w:rsid w:val="00A10FD9"/>
+    <w:pPr>
+      <w:keepNext/>
+      <w:keepLines/>
+      <w:spacing w:after="0"/>
+      <w:outlineLvl w:val="7"/>
+    </w:pPr>
+    <w:rPr>
+      <w:rFonts w:eastAsiaTheme="majorEastAsia" w:cstheme="majorBidi"/>
+      <w:i/>
+      <w:iCs/>
+      <w:color w:val="272727" w:themeColor="text1" w:themeTint="D8"/>
+    </w:rPr>
+  </w:style>
+  <w:style w:type="paragraph" w:styleId="Heading9">
+    <w:name w:val="heading 9"/>
+    <w:basedOn w:val="Normal"/>
+    <w:next w:val="BodyText"/>
+    <w:link w:val="Heading9Char"/>
+    <w:uiPriority w:val="9"/>
+    <w:semiHidden/>
+    <w:unhideWhenUsed/>
+    <w:qFormat/>
+    <w:rsid w:val="00A10FD9"/>
+    <w:pPr>
+      <w:keepNext/>
+      <w:keepLines/>
+      <w:spacing w:after="0"/>
+      <w:outlineLvl w:val="8"/>
+    </w:pPr>
+    <w:rPr>
+      <w:rFonts w:eastAsiaTheme="majorEastAsia" w:cstheme="majorBidi"/>
+      <w:color w:val="272727" w:themeColor="text1" w:themeTint="D8"/>
+    </w:rPr>
+  </w:style>
+  <w:style w:type="character" w:customStyle="1" w:styleId="Heading1Char">
+    <w:name w:val="Heading 1 Char"/>
+    <w:basedOn w:val="DefaultParagraphFont"/>
+    <w:link w:val="Heading1"/>
+    <w:uiPriority w:val="9"/>
+    <w:rsid w:val="00A10FD9"/>
+    <w:rPr>
+      <w:rFonts w:asciiTheme="majorHAnsi" w:eastAsiaTheme="majorEastAsia" w:hAnsiTheme="majorHAnsi" w:cstheme="majorBidi"/>
+      <w:color w:val="0F4761" w:themeColor="accent1" w:themeShade="BF"/>
+      <w:sz w:val="40"/>
+      <w:szCs w:val="40"/>
+    </w:rPr>
+  </w:style>
+  <w:style w:type="character" w:customStyle="1" w:styleId="Heading2Char">
+    <w:name w:val="Heading 2 Char"/>
+    <w:basedOn w:val="DefaultParagraphFont"/>
+    <w:link w:val="Heading2"/>
+    <w:uiPriority w:val="9"/>
+    <w:semiHidden/>
+    <w:rsid w:val="00A10FD9"/>
     <w:rPr>
       <w:rFonts w:asciiTheme="majorHAnsi" w:eastAsiaTheme="majorEastAsia" w:hAnsiTheme="majorHAnsi" w:cstheme="majorBidi"/>
       <w:color w:val="0F4761" w:themeColor="accent1" w:themeShade="BF"/>
@@ -743,22 +932,13 @@
       <w:szCs w:val="32"/>
     </w:rPr>
   </w:style>
-  <w:style w:type="paragraph" w:styleId="Heading3">
-    <w:name w:val="heading 3"/>
-    <w:basedOn w:val="Normal"/>
-    <w:next w:val="BodyText"/>
-    <w:link w:val="Heading3Char"/>
-    <w:uiPriority w:val="9"/>
-    <w:semiHidden/>
-    <w:unhideWhenUsed/>
-    <w:qFormat/>
-    <w:rsid w:val="00A10FD9"/>
-    <w:pPr>
-      <w:keepNext/>
-      <w:keepLines/>
-      <w:spacing w:before="160" w:after="80"/>
-      <w:outlineLvl w:val="2"/>
-    </w:pPr>
+  <w:style w:type="character" w:customStyle="1" w:styleId="Heading3Char">
+    <w:name w:val="Heading 3 Char"/>
+    <w:basedOn w:val="DefaultParagraphFont"/>
+    <w:link w:val="Heading3"/>
+    <w:uiPriority w:val="9"/>
+    <w:semiHidden/>
+    <w:rsid w:val="00A10FD9"/>
     <w:rPr>
       <w:rFonts w:eastAsiaTheme="majorEastAsia" w:cstheme="majorBidi"/>
       <w:color w:val="0F4761" w:themeColor="accent1" w:themeShade="BF"/>
@@ -766,22 +946,13 @@
       <w:szCs w:val="28"/>
     </w:rPr>
   </w:style>
-  <w:style w:type="paragraph" w:styleId="Heading4">
-    <w:name w:val="heading 4"/>
-    <w:basedOn w:val="Normal"/>
-    <w:next w:val="BodyText"/>
-    <w:link w:val="Heading4Char"/>
-    <w:uiPriority w:val="9"/>
-    <w:semiHidden/>
-    <w:unhideWhenUsed/>
-    <w:qFormat/>
-    <w:rsid w:val="00A10FD9"/>
-    <w:pPr>
-      <w:keepNext/>
-      <w:keepLines/>
-      <w:spacing w:before="80" w:after="40"/>
-      <w:outlineLvl w:val="3"/>
-    </w:pPr>
+  <w:style w:type="character" w:customStyle="1" w:styleId="Heading4Char">
+    <w:name w:val="Heading 4 Char"/>
+    <w:basedOn w:val="DefaultParagraphFont"/>
+    <w:link w:val="Heading4"/>
+    <w:uiPriority w:val="9"/>
+    <w:semiHidden/>
+    <w:rsid w:val="00A10FD9"/>
     <w:rPr>
       <w:rFonts w:eastAsiaTheme="majorEastAsia" w:cstheme="majorBidi"/>
       <w:i/>
@@ -789,43 +960,25 @@
       <w:color w:val="0F4761" w:themeColor="accent1" w:themeShade="BF"/>
     </w:rPr>
   </w:style>
-  <w:style w:type="paragraph" w:styleId="Heading5">
-    <w:name w:val="heading 5"/>
-    <w:basedOn w:val="Normal"/>
-    <w:next w:val="BodyText"/>
-    <w:link w:val="Heading5Char"/>
-    <w:uiPriority w:val="9"/>
-    <w:semiHidden/>
-    <w:unhideWhenUsed/>
-    <w:qFormat/>
-    <w:rsid w:val="00A10FD9"/>
-    <w:pPr>
-      <w:keepNext/>
-      <w:keepLines/>
-      <w:spacing w:before="80" w:after="40"/>
-      <w:outlineLvl w:val="4"/>
-    </w:pPr>
+  <w:style w:type="character" w:customStyle="1" w:styleId="Heading5Char">
+    <w:name w:val="Heading 5 Char"/>
+    <w:basedOn w:val="DefaultParagraphFont"/>
+    <w:link w:val="Heading5"/>
+    <w:uiPriority w:val="9"/>
+    <w:semiHidden/>
+    <w:rsid w:val="00A10FD9"/>
     <w:rPr>
       <w:rFonts w:eastAsiaTheme="majorEastAsia" w:cstheme="majorBidi"/>
       <w:color w:val="0F4761" w:themeColor="accent1" w:themeShade="BF"/>
     </w:rPr>
   </w:style>
-  <w:style w:type="paragraph" w:styleId="Heading6">
-    <w:name w:val="heading 6"/>
-    <w:basedOn w:val="Normal"/>
-    <w:next w:val="BodyText"/>
-    <w:link w:val="Heading6Char"/>
-    <w:uiPriority w:val="9"/>
-    <w:semiHidden/>
-    <w:unhideWhenUsed/>
-    <w:qFormat/>
-    <w:rsid w:val="00A10FD9"/>
-    <w:pPr>
-      <w:keepNext/>
-      <w:keepLines/>
-      <w:spacing w:before="40" w:after="0"/>
-      <w:outlineLvl w:val="5"/>
-    </w:pPr>
+  <w:style w:type="character" w:customStyle="1" w:styleId="Heading6Char">
+    <w:name w:val="Heading 6 Char"/>
+    <w:basedOn w:val="DefaultParagraphFont"/>
+    <w:link w:val="Heading6"/>
+    <w:uiPriority w:val="9"/>
+    <w:semiHidden/>
+    <w:rsid w:val="00A10FD9"/>
     <w:rPr>
       <w:rFonts w:eastAsiaTheme="majorEastAsia" w:cstheme="majorBidi"/>
       <w:i/>
@@ -833,43 +986,25 @@
       <w:color w:val="595959" w:themeColor="text1" w:themeTint="A6"/>
     </w:rPr>
   </w:style>
-  <w:style w:type="paragraph" w:styleId="Heading7">
-    <w:name w:val="heading 7"/>
-    <w:basedOn w:val="Normal"/>
-    <w:next w:val="BodyText"/>
-    <w:link w:val="Heading7Char"/>
-    <w:uiPriority w:val="9"/>
-    <w:semiHidden/>
-    <w:unhideWhenUsed/>
-    <w:qFormat/>
-    <w:rsid w:val="00A10FD9"/>
-    <w:pPr>
-      <w:keepNext/>
-      <w:keepLines/>
-      <w:spacing w:before="40" w:after="0"/>
-      <w:outlineLvl w:val="6"/>
-    </w:pPr>
+  <w:style w:type="character" w:customStyle="1" w:styleId="Heading7Char">
+    <w:name w:val="Heading 7 Char"/>
+    <w:basedOn w:val="DefaultParagraphFont"/>
+    <w:link w:val="Heading7"/>
+    <w:uiPriority w:val="9"/>
+    <w:semiHidden/>
+    <w:rsid w:val="00A10FD9"/>
     <w:rPr>
       <w:rFonts w:eastAsiaTheme="majorEastAsia" w:cstheme="majorBidi"/>
       <w:color w:val="595959" w:themeColor="text1" w:themeTint="A6"/>
     </w:rPr>
   </w:style>
-  <w:style w:type="paragraph" w:styleId="Heading8">
-    <w:name w:val="heading 8"/>
-    <w:basedOn w:val="Normal"/>
-    <w:next w:val="BodyText"/>
-    <w:link w:val="Heading8Char"/>
-    <w:uiPriority w:val="9"/>
-    <w:semiHidden/>
-    <w:unhideWhenUsed/>
-    <w:qFormat/>
-    <w:rsid w:val="00A10FD9"/>
-    <w:pPr>
-      <w:keepNext/>
-      <w:keepLines/>
-      <w:spacing w:after="0"/>
-      <w:outlineLvl w:val="7"/>
-    </w:pPr>
+  <w:style w:type="character" w:customStyle="1" w:styleId="Heading8Char">
+    <w:name w:val="Heading 8 Char"/>
+    <w:basedOn w:val="DefaultParagraphFont"/>
+    <w:link w:val="Heading8"/>
+    <w:uiPriority w:val="9"/>
+    <w:semiHidden/>
+    <w:rsid w:val="00A10FD9"/>
     <w:rPr>
       <w:rFonts w:eastAsiaTheme="majorEastAsia" w:cstheme="majorBidi"/>
       <w:i/>
@@ -877,134 +1012,6 @@
       <w:color w:val="272727" w:themeColor="text1" w:themeTint="D8"/>
     </w:rPr>
   </w:style>
-  <w:style w:type="paragraph" w:styleId="Heading9">
-    <w:name w:val="heading 9"/>
-    <w:basedOn w:val="Normal"/>
-    <w:next w:val="BodyText"/>
-    <w:link w:val="Heading9Char"/>
-    <w:uiPriority w:val="9"/>
-    <w:semiHidden/>
-    <w:unhideWhenUsed/>
-    <w:qFormat/>
-    <w:rsid w:val="00A10FD9"/>
-    <w:pPr>
-      <w:keepNext/>
-      <w:keepLines/>
-      <w:spacing w:after="0"/>
-      <w:outlineLvl w:val="8"/>
-    </w:pPr>
-    <w:rPr>
-      <w:rFonts w:eastAsiaTheme="majorEastAsia" w:cstheme="majorBidi"/>
-      <w:color w:val="272727" w:themeColor="text1" w:themeTint="D8"/>
-    </w:rPr>
-  </w:style>
-  <w:style w:type="character" w:customStyle="1" w:styleId="Heading1Char">
-    <w:name w:val="Heading 1 Char"/>
-    <w:basedOn w:val="DefaultParagraphFont"/>
-    <w:link w:val="Heading1"/>
-    <w:uiPriority w:val="9"/>
-    <w:rsid w:val="00A10FD9"/>
-    <w:rPr>
-      <w:rFonts w:asciiTheme="majorHAnsi" w:eastAsiaTheme="majorEastAsia" w:hAnsiTheme="majorHAnsi" w:cstheme="majorBidi"/>
-      <w:color w:val="0F4761" w:themeColor="accent1" w:themeShade="BF"/>
-      <w:sz w:val="40"/>
-      <w:szCs w:val="40"/>
-    </w:rPr>
-  </w:style>
-  <w:style w:type="character" w:customStyle="1" w:styleId="Heading2Char">
-    <w:name w:val="Heading 2 Char"/>
-    <w:basedOn w:val="DefaultParagraphFont"/>
-    <w:link w:val="Heading2"/>
-    <w:uiPriority w:val="9"/>
-    <w:semiHidden/>
-    <w:rsid w:val="00A10FD9"/>
-    <w:rPr>
-      <w:rFonts w:asciiTheme="majorHAnsi" w:eastAsiaTheme="majorEastAsia" w:hAnsiTheme="majorHAnsi" w:cstheme="majorBidi"/>
-      <w:color w:val="0F4761" w:themeColor="accent1" w:themeShade="BF"/>
-      <w:sz w:val="32"/>
-      <w:szCs w:val="32"/>
-    </w:rPr>
-  </w:style>
-  <w:style w:type="character" w:customStyle="1" w:styleId="Heading3Char">
-    <w:name w:val="Heading 3 Char"/>
-    <w:basedOn w:val="DefaultParagraphFont"/>
-    <w:link w:val="Heading3"/>
-    <w:uiPriority w:val="9"/>
-    <w:semiHidden/>
-    <w:rsid w:val="00A10FD9"/>
-    <w:rPr>
-      <w:rFonts w:eastAsiaTheme="majorEastAsia" w:cstheme="majorBidi"/>
-      <w:color w:val="0F4761" w:themeColor="accent1" w:themeShade="BF"/>
-      <w:sz w:val="28"/>
-      <w:szCs w:val="28"/>
-    </w:rPr>
-  </w:style>
-  <w:style w:type="character" w:customStyle="1" w:styleId="Heading4Char">
-    <w:name w:val="Heading 4 Char"/>
-    <w:basedOn w:val="DefaultParagraphFont"/>
-    <w:link w:val="Heading4"/>
-    <w:uiPriority w:val="9"/>
-    <w:semiHidden/>
-    <w:rsid w:val="00A10FD9"/>
-    <w:rPr>
-      <w:rFonts w:eastAsiaTheme="majorEastAsia" w:cstheme="majorBidi"/>
-      <w:i/>
-      <w:iCs/>
-      <w:color w:val="0F4761" w:themeColor="accent1" w:themeShade="BF"/>
-    </w:rPr>
-  </w:style>
-  <w:style w:type="character" w:customStyle="1" w:styleId="Heading5Char">
-    <w:name w:val="Heading 5 Char"/>
-    <w:basedOn w:val="DefaultParagraphFont"/>
-    <w:link w:val="Heading5"/>
-    <w:uiPriority w:val="9"/>
-    <w:semiHidden/>
-    <w:rsid w:val="00A10FD9"/>
-    <w:rPr>
-      <w:rFonts w:eastAsiaTheme="majorEastAsia" w:cstheme="majorBidi"/>
-      <w:color w:val="0F4761" w:themeColor="accent1" w:themeShade="BF"/>
-    </w:rPr>
-  </w:style>
-  <w:style w:type="character" w:customStyle="1" w:styleId="Heading6Char">
-    <w:name w:val="Heading 6 Char"/>
-    <w:basedOn w:val="DefaultParagraphFont"/>
-    <w:link w:val="Heading6"/>
-    <w:uiPriority w:val="9"/>
-    <w:semiHidden/>
-    <w:rsid w:val="00A10FD9"/>
-    <w:rPr>
-      <w:rFonts w:eastAsiaTheme="majorEastAsia" w:cstheme="majorBidi"/>
-      <w:i/>
-      <w:iCs/>
-      <w:color w:val="595959" w:themeColor="text1" w:themeTint="A6"/>
-    </w:rPr>
-  </w:style>
-  <w:style w:type="character" w:customStyle="1" w:styleId="Heading7Char">
-    <w:name w:val="Heading 7 Char"/>
-    <w:basedOn w:val="DefaultParagraphFont"/>
-    <w:link w:val="Heading7"/>
-    <w:uiPriority w:val="9"/>
-    <w:semiHidden/>
-    <w:rsid w:val="00A10FD9"/>
-    <w:rPr>
-      <w:rFonts w:eastAsiaTheme="majorEastAsia" w:cstheme="majorBidi"/>
-      <w:color w:val="595959" w:themeColor="text1" w:themeTint="A6"/>
-    </w:rPr>
-  </w:style>
-  <w:style w:type="character" w:customStyle="1" w:styleId="Heading8Char">
-    <w:name w:val="Heading 8 Char"/>
-    <w:basedOn w:val="DefaultParagraphFont"/>
-    <w:link w:val="Heading8"/>
-    <w:uiPriority w:val="9"/>
-    <w:semiHidden/>
-    <w:rsid w:val="00A10FD9"/>
-    <w:rPr>
-      <w:rFonts w:eastAsiaTheme="majorEastAsia" w:cstheme="majorBidi"/>
-      <w:i/>
-      <w:iCs/>
-      <w:color w:val="272727" w:themeColor="text1" w:themeTint="D8"/>
-    </w:rPr>
-  </w:style>
   <w:style w:type="character" w:customStyle="1" w:styleId="Heading9Char">
     <w:name w:val="Heading 9 Char"/>
     <w:basedOn w:val="DefaultParagraphFont"/>
@@ -1017,29 +1024,39 @@
       <w:color w:val="272727" w:themeColor="text1" w:themeTint="D8"/>
     </w:rPr>
   </w:style>
+  <w:style w:type="paragraph" w:customStyle="1" w:styleId="ListItem">
+    <w:name w:val="List Item"/>
+    <w:basedOn w:val="BodyText"/>
+    <w:qFormat/>
+    <w:pPr>
+      <w:spacing w:before="0" w:after="0" w:line="518" w:lineRule="exact"/>
+      <w:ind w:left="720" w:hanging="720"/>
+    </w:pPr>
+  </w:style>
   <w:style w:type="paragraph" w:styleId="BlockText">
     <w:name w:val="Block Text"/>
-    <w:basedOn w:val="Normal"/>
-    <w:next w:val="BodyText"/>
+    <w:basedOn w:val="BodyText"/>
+    <w:next w:val="BodyText"/>
+    <w:uiPriority w:val="9"/>
+    <w:unhideWhenUsed/>
+    <w:qFormat/>
+    <w:pPr>
+      <w:spacing w:before="280" w:after="280" w:line="288" w:lineRule="exact"/>
+      <w:ind w:firstLine="0" w:left="720" w:right="720"/>
+    </w:pPr>
+  </w:style>
+  <w:style w:type="paragraph" w:styleId="FootnoteText">
+    <w:name w:val="Footnote Text"/>
+    <w:basedOn w:val="Normal"/>
+    <w:next w:val="FootnoteText"/>
+    <w:uiPriority w:val="9"/>
+    <w:unhideWhenUsed/>
     <w:qFormat/>
     <w:pPr>
       <w:keepLines/>
-      <w:spacing w:before="280" w:after="280" w:line="240" w:lineRule="auto"/>
-      <w:ind w:left="720" w:right="720" w:firstLine="0"/>
-    </w:pPr>
-  </w:style>
-  <w:style w:type="paragraph" w:styleId="FootnoteText">
-    <w:name w:val="footnote text"/>
-    <w:basedOn w:val="Normal"/>
-    <w:link w:val="FootnoteTextChar"/>
-    <w:uiPriority w:val="99"/>
-    <w:unhideWhenUsed/>
-    <w:pPr>
-      <w:spacing w:before="0" w:after="100" w:line="240" w:lineRule="auto"/>
-      <w:ind w:left="0" w:firstLine="0"/>
-    </w:pPr>
-    <w:rPr>
-      <w:rFonts w:ascii="EB Garamond" w:hAnsi="EB Garamond" w:eastAsia="EB Garamond" w:cs="EB Garamond"/>
+      <w:spacing w:before="0" w:after="140" w:line="288" w:lineRule="exact"/>
+    </w:pPr>
+    <w:rPr>
       <w:sz w:val="28"/>
       <w:szCs w:val="28"/>
     </w:rPr>
@@ -1052,8 +1069,8 @@
     <w:unhideWhenUsed/>
     <w:qFormat/>
     <w:pPr>
-      <w:spacing w:before="100" w:after="100"/>
-      <w:ind w:firstLine="0" w:left="480" w:right="480"/>
+      <w:spacing w:before="280" w:after="280"/>
+      <w:ind w:firstLine="0" w:left="720" w:right="720"/>
     </w:pPr>
   </w:style>
   <w:style w:type="character" w:default="1" w:styleId="DefaultParagraphFont">
@@ -1161,7 +1178,7 @@
     <w:name w:val="Hyperlink"/>
     <w:basedOn w:val="BodyTextChar"/>
     <w:rPr>
-      <w:color w:val="4F81BD" w:themeColor="accent1"/>
+      <w:color w:val="000000"/>
     </w:rPr>
   </w:style>
   <w:style w:type="paragraph" w:styleId="TOCHeading">
@@ -1180,152 +1197,6 @@
       <w:b w:val="0"/>
       <w:bCs w:val="0"/>
       <w:color w:val="365F91" w:themeColor="accent1" w:themeShade="BF"/>
-    </w:rPr>
-  </w:style>
-  <w:style w:type="paragraph" w:styleId="Footer">
-    <w:name w:val="footer"/>
-    <w:basedOn w:val="Normal"/>
-    <w:uiPriority w:val="99"/>
-    <w:unhideWhenUsed/>
-    <w:pPr>
-      <w:tabs>
-        <w:tab w:val="center" w:pos="4680"/>
-        <w:tab w:val="right" w:pos="9360"/>
-      </w:tabs>
-      <w:spacing w:before="0" w:after="0" w:line="240" w:lineRule="auto"/>
-      <w:jc w:val="center"/>
-    </w:pPr>
-    <w:rPr>
-      <w:rFonts w:ascii="EB Garamond" w:hAnsi="EB Garamond" w:eastAsia="EB Garamond" w:cs="EB Garamond"/>
-      <w:sz w:val="28"/>
-      <w:szCs w:val="28"/>
-    </w:rPr>
-  </w:style>
-  <w:style w:type="paragraph" w:customStyle="1" w:styleId="PointHead">
-    <w:name w:val="Point Head"/>
-    <w:basedOn w:val="Normal"/>
-    <w:next w:val="BodyText"/>
-    <w:qFormat/>
-    <w:pPr>
-      <w:keepNext/>
-      <w:keepLines/>
-      <w:spacing w:before="336" w:after="280" w:line="240" w:lineRule="auto"/>
-      <w:jc w:val="center"/>
-    </w:pPr>
-    <w:rPr>
-      <w:b/>
-      <w:bCs/>
-    </w:rPr>
-  </w:style>
-  <w:style w:type="paragraph" w:customStyle="1" w:styleId="SectionHead">
-    <w:name w:val="Section Head"/>
-    <w:basedOn w:val="Normal"/>
-    <w:next w:val="BodyText"/>
-    <w:qFormat/>
-    <w:pPr>
-      <w:keepNext/>
-      <w:keepLines/>
-      <w:spacing w:before="420" w:after="308" w:line="240" w:lineRule="auto"/>
-      <w:jc w:val="center"/>
-    </w:pPr>
-    <w:rPr>
-      <w:b/>
-      <w:bCs/>
-    </w:rPr>
-  </w:style>
-  <w:style w:type="paragraph" w:customStyle="1" w:styleId="KeepBody">
-    <w:name w:val="Keep Body"/>
-    <w:basedOn w:val="BodyText"/>
-    <w:qFormat/>
-    <w:pPr>
-      <w:keepNext/>
-      <w:keepLines/>
-      <w:spacing w:before="0" w:after="0" w:line="628" w:lineRule="exact"/>
-      <w:ind w:left="0" w:firstLine="720"/>
-    </w:pPr>
-  </w:style>
-  <w:style w:type="paragraph" w:customStyle="1" w:styleId="SectionHeadTop">
-    <w:name w:val="Section Head Top"/>
-    <w:basedOn w:val="SectionHead"/>
-    <w:next w:val="BodyText"/>
-    <w:qFormat/>
-    <w:pPr>
-      <w:keepNext/>
-      <w:keepLines/>
-      <w:spacing w:before="0" w:after="308" w:line="240" w:lineRule="auto"/>
-      <w:jc w:val="center"/>
-    </w:pPr>
-    <w:rPr>
-      <w:b/>
-      <w:bCs/>
-    </w:rPr>
-  </w:style>
-  <w:style w:type="paragraph" w:customStyle="1" w:styleId="Hang1">
-    <w:name w:val="Hang 1"/>
-    <w:basedOn w:val="Normal"/>
-    <w:next w:val="BodyText"/>
-    <w:qFormat/>
-    <w:pPr>
-      <w:keepNext/>
-      <w:keepLines/>
-      <w:spacing w:before="308" w:after="252" w:line="240" w:lineRule="auto"/>
-      <w:ind w:left="1440" w:hanging="720"/>
-      <w:jc w:val="left"/>
-    </w:pPr>
-    <w:rPr>
-      <w:b/>
-      <w:bCs/>
-    </w:rPr>
-  </w:style>
-  <w:style w:type="paragraph" w:customStyle="1" w:styleId="Hang2">
-    <w:name w:val="Hang 2"/>
-    <w:basedOn w:val="Normal"/>
-    <w:next w:val="BodyText"/>
-    <w:qFormat/>
-    <w:pPr>
-      <w:keepNext/>
-      <w:keepLines/>
-      <w:spacing w:before="308" w:after="252" w:line="240" w:lineRule="auto"/>
-      <w:ind w:left="2160" w:hanging="720"/>
-      <w:jc w:val="left"/>
-    </w:pPr>
-    <w:rPr>
-      <w:b/>
-      <w:bCs/>
-    </w:rPr>
-  </w:style>
-  <w:style w:type="paragraph" w:customStyle="1" w:styleId="Hang3">
-    <w:name w:val="Hang 3"/>
-    <w:basedOn w:val="Normal"/>
-    <w:next w:val="BodyText"/>
-    <w:qFormat/>
-    <w:pPr>
-      <w:keepNext/>
-      <w:keepLines/>
-      <w:spacing w:before="308" w:after="252" w:line="240" w:lineRule="auto"/>
-      <w:ind w:left="2880" w:hanging="720"/>
-      <w:jc w:val="left"/>
-    </w:pPr>
-    <w:rPr>
-      <w:b/>
-      <w:bCs/>
-    </w:rPr>
-  </w:style>
-  <w:style w:type="paragraph" w:customStyle="1" w:styleId="Hang4">
-    <w:name w:val="Hang 4"/>
-    <w:basedOn w:val="Normal"/>
-    <w:next w:val="BodyText"/>
-    <w:qFormat/>
-    <w:pPr>
-      <w:keepNext/>
-      <w:keepLines/>
-      <w:spacing w:before="308" w:after="252" w:line="240" w:lineRule="auto"/>
-      <w:ind w:left="3600" w:hanging="720"/>
-      <w:jc w:val="left"/>
-    </w:pPr>
-    <w:rPr>
-      <w:b/>
-      <w:bCs/>
     </w:rPr>
   </w:style>
 </w:styles>
@@ -1374,7 +1245,7 @@
     </a:clrScheme>
     <a:fontScheme name="Office">
       <a:majorFont>
-        <a:latin typeface="EB Garamond" panose="02110004020202020204"/>
+        <a:latin typeface="Aptos Display" panose="02110004020202020204"/>
         <a:ea typeface=""/>
         <a:cs typeface=""/>
         <a:font script="Jpan" typeface="游ゴシック Light"/>
@@ -1426,7 +1297,7 @@
         <a:font script="Tfng" typeface="Ebrima"/>
       </a:majorFont>
       <a:minorFont>
-        <a:latin typeface="EB Garamond" panose="02110004020202020204"/>
+        <a:latin typeface="Aptos" panose="02110004020202020204"/>
         <a:ea typeface=""/>
         <a:cs typeface=""/>
         <a:font script="Jpan" typeface="游明朝"/>

</xml_diff>